<commit_message>
Revisa la Actividad 6.2 tras probarla en directo y regenera su plantilla
Corrige terminología de consola (desencadenadores, Configuración adicional,
Actualizar desde), quita referencias al profesor en tercera persona y las
capturas de referencia ya obsoletas, simplifica los nombres de bucket a la
convención escaparate-imagenes-<tu-identificador>, y añade pistas puntuales
en la Parte B (tipos de API, servidor de comparación, sección de precios).
Regenera la plantilla del alumno con captureBox para las medidas de latencia
y coste, en vez de solo texto libre.
</commit_message>
<xml_diff>
--- a/docs/tema6/plantillas/Actividad_6_2_INU_Plantilla.docx
+++ b/docs/tema6/plantillas/Actividad_6_2_INU_Plantilla.docx
@@ -427,7 +427,7 @@
     </w:tbl>
     <w:p>
       <w:pPr>
-        <w:spacing w:after="200"/>
+        <w:spacing w:after="160"/>
       </w:pPr>
     </w:p>
     <w:p>
@@ -446,7 +446,21 @@
           <w:sz w:val="24"/>
           <w:szCs w:val="24"/>
         </w:rPr>
-        <w:t xml:space="preserve">Paso 3 — Sube el código y configura el disparador de S3</w:t>
+        <w:t xml:space="preserve">Reflexiona (Paso 2)</w:t>
+      </w:r>
+    </w:p>
+    <w:p>
+      <w:pPr>
+        <w:spacing w:after="100"/>
+      </w:pPr>
+      <w:r>
+        <w:rPr>
+          <w:rFonts w:ascii="Arial" w:cs="Arial" w:eastAsia="Arial" w:hAnsi="Arial"/>
+          <w:color w:val="212121"/>
+          <w:sz w:val="22"/>
+          <w:szCs w:val="22"/>
+        </w:rPr>
+        <w:t xml:space="preserve">Tu función tiene 512 MB de memoria y no 128 MB: ¿más cara, más barata o igual por invocación? Razónalo antes de comprobarlo con los tiempos reales del Paso 3.</w:t>
       </w:r>
     </w:p>
     <w:tbl>
@@ -465,41 +479,8 @@
         <w:gridCol w:w="9638"/>
       </w:tblGrid>
       <w:tr>
-        <w:tc>
-          <w:tcPr>
-            <w:tcW w:type="dxa" w:w="9638"/>
-            <w:tcBorders>
-              <w:top w:val="none" w:color="FFFFFF" w:sz="0"/>
-              <w:left w:val="none" w:color="FFFFFF" w:sz="0"/>
-              <w:bottom w:val="none" w:color="FFFFFF" w:sz="0"/>
-              <w:right w:val="none" w:color="FFFFFF" w:sz="0"/>
-            </w:tcBorders>
-            <w:shd w:fill="3949AB" w:val="clear"/>
-            <w:tcMar>
-              <w:top w:type="dxa" w:w="80"/>
-              <w:left w:type="dxa" w:w="160"/>
-              <w:bottom w:type="dxa" w:w="80"/>
-              <w:right w:type="dxa" w:w="160"/>
-            </w:tcMar>
-          </w:tcPr>
-          <w:p>
-            <w:r>
-              <w:rPr>
-                <w:rFonts w:ascii="Arial" w:cs="Arial" w:eastAsia="Arial" w:hAnsi="Arial"/>
-                <w:b/>
-                <w:bCs/>
-                <w:color w:val="FFFFFF"/>
-                <w:sz w:val="20"/>
-                <w:szCs w:val="20"/>
-              </w:rPr>
-              <w:t xml:space="preserve">📸 Disparador de S3 configurado sobre la función, con el filtro de prefijo escaparate/</w:t>
-            </w:r>
-          </w:p>
-        </w:tc>
-      </w:tr>
-      <w:tr>
         <w:trPr>
-          <w:trHeight w:val="2400"/>
+          <w:trHeight w:val="480"/>
         </w:trPr>
         <w:tc>
           <w:tcPr>
@@ -512,26 +493,83 @@
             </w:tcBorders>
             <w:shd w:fill="FAFAFA" w:val="clear"/>
             <w:tcMar>
-              <w:top w:type="dxa" w:w="80"/>
-              <w:left w:type="dxa" w:w="160"/>
-              <w:bottom w:type="dxa" w:w="80"/>
-              <w:right w:type="dxa" w:w="160"/>
-            </w:tcMar>
-          </w:tcPr>
-          <w:p>
-            <w:pPr>
-              <w:jc w:val="center"/>
-            </w:pPr>
-            <w:r>
-              <w:rPr>
-                <w:rFonts w:ascii="Arial" w:cs="Arial" w:eastAsia="Arial" w:hAnsi="Arial"/>
-                <w:i/>
-                <w:iCs/>
-                <w:color w:val="757575"/>
-                <w:sz w:val="20"/>
-                <w:szCs w:val="20"/>
-              </w:rPr>
-              <w:t xml:space="preserve">[Pega aquí la captura de pantalla]</w:t>
+              <w:top w:type="dxa" w:w="60"/>
+              <w:left w:type="dxa" w:w="160"/>
+              <w:bottom w:type="dxa" w:w="60"/>
+              <w:right w:type="dxa" w:w="160"/>
+            </w:tcMar>
+          </w:tcPr>
+          <w:p>
+            <w:r>
+              <w:rPr>
+                <w:sz w:val="22"/>
+                <w:szCs w:val="22"/>
+              </w:rPr>
+              <w:t xml:space="preserve"/>
+            </w:r>
+          </w:p>
+        </w:tc>
+      </w:tr>
+      <w:tr>
+        <w:trPr>
+          <w:trHeight w:val="480"/>
+        </w:trPr>
+        <w:tc>
+          <w:tcPr>
+            <w:tcW w:type="dxa" w:w="9638"/>
+            <w:tcBorders>
+              <w:top w:val="single" w:color="E0E0E0" w:sz="4"/>
+              <w:left w:val="single" w:color="E0E0E0" w:sz="4"/>
+              <w:bottom w:val="single" w:color="E0E0E0" w:sz="4"/>
+              <w:right w:val="single" w:color="E0E0E0" w:sz="4"/>
+            </w:tcBorders>
+            <w:shd w:fill="FAFAFA" w:val="clear"/>
+            <w:tcMar>
+              <w:top w:type="dxa" w:w="60"/>
+              <w:left w:type="dxa" w:w="160"/>
+              <w:bottom w:type="dxa" w:w="60"/>
+              <w:right w:type="dxa" w:w="160"/>
+            </w:tcMar>
+          </w:tcPr>
+          <w:p>
+            <w:r>
+              <w:rPr>
+                <w:sz w:val="22"/>
+                <w:szCs w:val="22"/>
+              </w:rPr>
+              <w:t xml:space="preserve"/>
+            </w:r>
+          </w:p>
+        </w:tc>
+      </w:tr>
+      <w:tr>
+        <w:trPr>
+          <w:trHeight w:val="480"/>
+        </w:trPr>
+        <w:tc>
+          <w:tcPr>
+            <w:tcW w:type="dxa" w:w="9638"/>
+            <w:tcBorders>
+              <w:top w:val="single" w:color="E0E0E0" w:sz="4"/>
+              <w:left w:val="single" w:color="E0E0E0" w:sz="4"/>
+              <w:bottom w:val="single" w:color="E0E0E0" w:sz="4"/>
+              <w:right w:val="single" w:color="E0E0E0" w:sz="4"/>
+            </w:tcBorders>
+            <w:shd w:fill="FAFAFA" w:val="clear"/>
+            <w:tcMar>
+              <w:top w:type="dxa" w:w="60"/>
+              <w:left w:type="dxa" w:w="160"/>
+              <w:bottom w:type="dxa" w:w="60"/>
+              <w:right w:type="dxa" w:w="160"/>
+            </w:tcMar>
+          </w:tcPr>
+          <w:p>
+            <w:r>
+              <w:rPr>
+                <w:sz w:val="22"/>
+                <w:szCs w:val="22"/>
+              </w:rPr>
+              <w:t xml:space="preserve"/>
             </w:r>
           </w:p>
         </w:tc>
@@ -539,8 +577,27 @@
     </w:tbl>
     <w:p>
       <w:pPr>
-        <w:spacing w:after="120"/>
-      </w:pPr>
+        <w:spacing w:after="200"/>
+      </w:pPr>
+    </w:p>
+    <w:p>
+      <w:pPr>
+        <w:pBdr>
+          <w:bottom w:val="single" w:color="FFA000" w:sz="4" w:space="1"/>
+        </w:pBdr>
+        <w:spacing w:after="120" w:before="240"/>
+      </w:pPr>
+      <w:r>
+        <w:rPr>
+          <w:rFonts w:ascii="Arial" w:cs="Arial" w:eastAsia="Arial" w:hAnsi="Arial"/>
+          <w:b/>
+          <w:bCs/>
+          <w:color w:val="3949AB"/>
+          <w:sz w:val="24"/>
+          <w:szCs w:val="24"/>
+        </w:rPr>
+        <w:t xml:space="preserve">Paso 3 — Sube el código y configura el disparador de S3</w:t>
+      </w:r>
     </w:p>
     <w:tbl>
       <w:tblPr>
@@ -585,7 +642,7 @@
                 <w:sz w:val="20"/>
                 <w:szCs w:val="20"/>
               </w:rPr>
-              <w:t xml:space="preserve">📸 Miniatura generada automáticamente tras subir la foto original</w:t>
+              <w:t xml:space="preserve">📸 Disparador de S3 configurado sobre la función, con el filtro de prefijo escaparate/</w:t>
             </w:r>
           </w:p>
         </w:tc>
@@ -632,41 +689,8 @@
     </w:tbl>
     <w:p>
       <w:pPr>
-        <w:spacing w:after="160"/>
-      </w:pPr>
-    </w:p>
-    <w:p>
-      <w:pPr>
-        <w:pBdr>
-          <w:bottom w:val="single" w:color="FFA000" w:sz="4" w:space="1"/>
-        </w:pBdr>
-        <w:spacing w:after="120" w:before="240"/>
-      </w:pPr>
-      <w:r>
-        <w:rPr>
-          <w:rFonts w:ascii="Arial" w:cs="Arial" w:eastAsia="Arial" w:hAnsi="Arial"/>
-          <w:b/>
-          <w:bCs/>
-          <w:color w:val="3949AB"/>
-          <w:sz w:val="24"/>
-          <w:szCs w:val="24"/>
-        </w:rPr>
-        <w:t xml:space="preserve">Reflexiona</w:t>
-      </w:r>
-    </w:p>
-    <w:p>
-      <w:pPr>
-        <w:spacing w:after="100"/>
-      </w:pPr>
-      <w:r>
-        <w:rPr>
-          <w:rFonts w:ascii="Arial" w:cs="Arial" w:eastAsia="Arial" w:hAnsi="Arial"/>
-          <w:color w:val="212121"/>
-          <w:sz w:val="22"/>
-          <w:szCs w:val="22"/>
-        </w:rPr>
-        <w:t xml:space="preserve">Si se subieran cien fotos de producto a la vez (por ejemplo, al cargar un catálogo entero de golpe), ¿qué pasaría con tu función? Compáralo con lo que le pasaría a una única instancia si tuviera que procesar cien peticiones simultáneas de generación de miniaturas.</w:t>
-      </w:r>
+        <w:spacing w:after="120"/>
+      </w:pPr>
     </w:p>
     <w:tbl>
       <w:tblPr>
@@ -684,8 +708,41 @@
         <w:gridCol w:w="9638"/>
       </w:tblGrid>
       <w:tr>
+        <w:tc>
+          <w:tcPr>
+            <w:tcW w:type="dxa" w:w="9638"/>
+            <w:tcBorders>
+              <w:top w:val="none" w:color="FFFFFF" w:sz="0"/>
+              <w:left w:val="none" w:color="FFFFFF" w:sz="0"/>
+              <w:bottom w:val="none" w:color="FFFFFF" w:sz="0"/>
+              <w:right w:val="none" w:color="FFFFFF" w:sz="0"/>
+            </w:tcBorders>
+            <w:shd w:fill="3949AB" w:val="clear"/>
+            <w:tcMar>
+              <w:top w:type="dxa" w:w="80"/>
+              <w:left w:type="dxa" w:w="160"/>
+              <w:bottom w:type="dxa" w:w="80"/>
+              <w:right w:type="dxa" w:w="160"/>
+            </w:tcMar>
+          </w:tcPr>
+          <w:p>
+            <w:r>
+              <w:rPr>
+                <w:rFonts w:ascii="Arial" w:cs="Arial" w:eastAsia="Arial" w:hAnsi="Arial"/>
+                <w:b/>
+                <w:bCs/>
+                <w:color w:val="FFFFFF"/>
+                <w:sz w:val="20"/>
+                <w:szCs w:val="20"/>
+              </w:rPr>
+              <w:t xml:space="preserve">📸 Miniatura generada automáticamente tras subir la foto original</w:t>
+            </w:r>
+          </w:p>
+        </w:tc>
+      </w:tr>
+      <w:tr>
         <w:trPr>
-          <w:trHeight w:val="480"/>
+          <w:trHeight w:val="2400"/>
         </w:trPr>
         <w:tc>
           <w:tcPr>
@@ -698,115 +755,26 @@
             </w:tcBorders>
             <w:shd w:fill="FAFAFA" w:val="clear"/>
             <w:tcMar>
-              <w:top w:type="dxa" w:w="60"/>
-              <w:left w:type="dxa" w:w="160"/>
-              <w:bottom w:type="dxa" w:w="60"/>
-              <w:right w:type="dxa" w:w="160"/>
-            </w:tcMar>
-          </w:tcPr>
-          <w:p>
-            <w:r>
-              <w:rPr>
-                <w:sz w:val="22"/>
-                <w:szCs w:val="22"/>
-              </w:rPr>
-              <w:t xml:space="preserve"/>
-            </w:r>
-          </w:p>
-        </w:tc>
-      </w:tr>
-      <w:tr>
-        <w:trPr>
-          <w:trHeight w:val="480"/>
-        </w:trPr>
-        <w:tc>
-          <w:tcPr>
-            <w:tcW w:type="dxa" w:w="9638"/>
-            <w:tcBorders>
-              <w:top w:val="single" w:color="E0E0E0" w:sz="4"/>
-              <w:left w:val="single" w:color="E0E0E0" w:sz="4"/>
-              <w:bottom w:val="single" w:color="E0E0E0" w:sz="4"/>
-              <w:right w:val="single" w:color="E0E0E0" w:sz="4"/>
-            </w:tcBorders>
-            <w:shd w:fill="FAFAFA" w:val="clear"/>
-            <w:tcMar>
-              <w:top w:type="dxa" w:w="60"/>
-              <w:left w:type="dxa" w:w="160"/>
-              <w:bottom w:type="dxa" w:w="60"/>
-              <w:right w:type="dxa" w:w="160"/>
-            </w:tcMar>
-          </w:tcPr>
-          <w:p>
-            <w:r>
-              <w:rPr>
-                <w:sz w:val="22"/>
-                <w:szCs w:val="22"/>
-              </w:rPr>
-              <w:t xml:space="preserve"/>
-            </w:r>
-          </w:p>
-        </w:tc>
-      </w:tr>
-      <w:tr>
-        <w:trPr>
-          <w:trHeight w:val="480"/>
-        </w:trPr>
-        <w:tc>
-          <w:tcPr>
-            <w:tcW w:type="dxa" w:w="9638"/>
-            <w:tcBorders>
-              <w:top w:val="single" w:color="E0E0E0" w:sz="4"/>
-              <w:left w:val="single" w:color="E0E0E0" w:sz="4"/>
-              <w:bottom w:val="single" w:color="E0E0E0" w:sz="4"/>
-              <w:right w:val="single" w:color="E0E0E0" w:sz="4"/>
-            </w:tcBorders>
-            <w:shd w:fill="FAFAFA" w:val="clear"/>
-            <w:tcMar>
-              <w:top w:type="dxa" w:w="60"/>
-              <w:left w:type="dxa" w:w="160"/>
-              <w:bottom w:type="dxa" w:w="60"/>
-              <w:right w:type="dxa" w:w="160"/>
-            </w:tcMar>
-          </w:tcPr>
-          <w:p>
-            <w:r>
-              <w:rPr>
-                <w:sz w:val="22"/>
-                <w:szCs w:val="22"/>
-              </w:rPr>
-              <w:t xml:space="preserve"/>
-            </w:r>
-          </w:p>
-        </w:tc>
-      </w:tr>
-      <w:tr>
-        <w:trPr>
-          <w:trHeight w:val="480"/>
-        </w:trPr>
-        <w:tc>
-          <w:tcPr>
-            <w:tcW w:type="dxa" w:w="9638"/>
-            <w:tcBorders>
-              <w:top w:val="single" w:color="E0E0E0" w:sz="4"/>
-              <w:left w:val="single" w:color="E0E0E0" w:sz="4"/>
-              <w:bottom w:val="single" w:color="E0E0E0" w:sz="4"/>
-              <w:right w:val="single" w:color="E0E0E0" w:sz="4"/>
-            </w:tcBorders>
-            <w:shd w:fill="FAFAFA" w:val="clear"/>
-            <w:tcMar>
-              <w:top w:type="dxa" w:w="60"/>
-              <w:left w:type="dxa" w:w="160"/>
-              <w:bottom w:type="dxa" w:w="60"/>
-              <w:right w:type="dxa" w:w="160"/>
-            </w:tcMar>
-          </w:tcPr>
-          <w:p>
-            <w:r>
-              <w:rPr>
-                <w:sz w:val="22"/>
-                <w:szCs w:val="22"/>
-              </w:rPr>
-              <w:t xml:space="preserve"/>
+              <w:top w:type="dxa" w:w="80"/>
+              <w:left w:type="dxa" w:w="160"/>
+              <w:bottom w:type="dxa" w:w="80"/>
+              <w:right w:type="dxa" w:w="160"/>
+            </w:tcMar>
+          </w:tcPr>
+          <w:p>
+            <w:pPr>
+              <w:jc w:val="center"/>
+            </w:pPr>
+            <w:r>
+              <w:rPr>
+                <w:rFonts w:ascii="Arial" w:cs="Arial" w:eastAsia="Arial" w:hAnsi="Arial"/>
+                <w:i/>
+                <w:iCs/>
+                <w:color w:val="757575"/>
+                <w:sz w:val="20"/>
+                <w:szCs w:val="20"/>
+              </w:rPr>
+              <w:t xml:space="preserve">[Pega aquí la captura de pantalla]</w:t>
             </w:r>
           </w:p>
         </w:tc>
@@ -814,35 +782,7 @@
     </w:tbl>
     <w:p>
       <w:pPr>
-        <w:spacing w:after="200"/>
-      </w:pPr>
-    </w:p>
-    <w:p>
-      <w:r>
-        <w:br w:type="page"/>
-      </w:r>
-    </w:p>
-    <w:p>
-      <w:pPr>
-        <w:shd w:fill="3949AB" w:val="clear"/>
-        <w:spacing w:after="0" w:before="320"/>
-        <w:ind w:left="200" w:right="200"/>
-      </w:pPr>
-      <w:r>
-        <w:rPr>
-          <w:rFonts w:ascii="Arial" w:cs="Arial" w:eastAsia="Arial" w:hAnsi="Arial"/>
-          <w:b/>
-          <w:bCs/>
-          <w:color w:val="FFFFFF"/>
-          <w:sz w:val="26"/>
-          <w:szCs w:val="26"/>
-        </w:rPr>
-        <w:t xml:space="preserve">Parte B — Reto: mini API y comparación real</w:t>
-      </w:r>
-    </w:p>
-    <w:p>
-      <w:pPr>
-        <w:spacing w:after="120"/>
+        <w:spacing w:after="160"/>
       </w:pPr>
     </w:p>
     <w:p>
@@ -861,7 +801,21 @@
           <w:sz w:val="24"/>
           <w:szCs w:val="24"/>
         </w:rPr>
-        <w:t xml:space="preserve">Monta la mini API</w:t>
+        <w:t xml:space="preserve">Reflexiona</w:t>
+      </w:r>
+    </w:p>
+    <w:p>
+      <w:pPr>
+        <w:spacing w:after="100"/>
+      </w:pPr>
+      <w:r>
+        <w:rPr>
+          <w:rFonts w:ascii="Arial" w:cs="Arial" w:eastAsia="Arial" w:hAnsi="Arial"/>
+          <w:color w:val="212121"/>
+          <w:sz w:val="22"/>
+          <w:szCs w:val="22"/>
+        </w:rPr>
+        <w:t xml:space="preserve">Si se subieran cien fotos de producto a la vez (por ejemplo, al cargar un catálogo entero de golpe), ¿qué pasaría con tu función? Compáralo con lo que le pasaría a una única instancia si tuviera que procesar cien peticiones simultáneas de generación de miniaturas.</w:t>
       </w:r>
     </w:p>
     <w:tbl>
@@ -880,41 +834,8 @@
         <w:gridCol w:w="9638"/>
       </w:tblGrid>
       <w:tr>
-        <w:tc>
-          <w:tcPr>
-            <w:tcW w:type="dxa" w:w="9638"/>
-            <w:tcBorders>
-              <w:top w:val="none" w:color="FFFFFF" w:sz="0"/>
-              <w:left w:val="none" w:color="FFFFFF" w:sz="0"/>
-              <w:bottom w:val="none" w:color="FFFFFF" w:sz="0"/>
-              <w:right w:val="none" w:color="FFFFFF" w:sz="0"/>
-            </w:tcBorders>
-            <w:shd w:fill="3949AB" w:val="clear"/>
-            <w:tcMar>
-              <w:top w:type="dxa" w:w="80"/>
-              <w:left w:type="dxa" w:w="160"/>
-              <w:bottom w:type="dxa" w:w="80"/>
-              <w:right w:type="dxa" w:w="160"/>
-            </w:tcMar>
-          </w:tcPr>
-          <w:p>
-            <w:r>
-              <w:rPr>
-                <w:rFonts w:ascii="Arial" w:cs="Arial" w:eastAsia="Arial" w:hAnsi="Arial"/>
-                <w:b/>
-                <w:bCs/>
-                <w:color w:val="FFFFFF"/>
-                <w:sz w:val="20"/>
-                <w:szCs w:val="20"/>
-              </w:rPr>
-              <w:t xml:space="preserve">📸 La pasarela de API montada delante de la función, resolviendo la consulta de metadatos de una imagen de producto</w:t>
-            </w:r>
-          </w:p>
-        </w:tc>
-      </w:tr>
-      <w:tr>
         <w:trPr>
-          <w:trHeight w:val="2400"/>
+          <w:trHeight w:val="480"/>
         </w:trPr>
         <w:tc>
           <w:tcPr>
@@ -927,26 +848,115 @@
             </w:tcBorders>
             <w:shd w:fill="FAFAFA" w:val="clear"/>
             <w:tcMar>
-              <w:top w:type="dxa" w:w="80"/>
-              <w:left w:type="dxa" w:w="160"/>
-              <w:bottom w:type="dxa" w:w="80"/>
-              <w:right w:type="dxa" w:w="160"/>
-            </w:tcMar>
-          </w:tcPr>
-          <w:p>
-            <w:pPr>
-              <w:jc w:val="center"/>
-            </w:pPr>
-            <w:r>
-              <w:rPr>
-                <w:rFonts w:ascii="Arial" w:cs="Arial" w:eastAsia="Arial" w:hAnsi="Arial"/>
-                <w:i/>
-                <w:iCs/>
-                <w:color w:val="757575"/>
-                <w:sz w:val="20"/>
-                <w:szCs w:val="20"/>
-              </w:rPr>
-              <w:t xml:space="preserve">[Pega aquí la captura de pantalla]</w:t>
+              <w:top w:type="dxa" w:w="60"/>
+              <w:left w:type="dxa" w:w="160"/>
+              <w:bottom w:type="dxa" w:w="60"/>
+              <w:right w:type="dxa" w:w="160"/>
+            </w:tcMar>
+          </w:tcPr>
+          <w:p>
+            <w:r>
+              <w:rPr>
+                <w:sz w:val="22"/>
+                <w:szCs w:val="22"/>
+              </w:rPr>
+              <w:t xml:space="preserve"/>
+            </w:r>
+          </w:p>
+        </w:tc>
+      </w:tr>
+      <w:tr>
+        <w:trPr>
+          <w:trHeight w:val="480"/>
+        </w:trPr>
+        <w:tc>
+          <w:tcPr>
+            <w:tcW w:type="dxa" w:w="9638"/>
+            <w:tcBorders>
+              <w:top w:val="single" w:color="E0E0E0" w:sz="4"/>
+              <w:left w:val="single" w:color="E0E0E0" w:sz="4"/>
+              <w:bottom w:val="single" w:color="E0E0E0" w:sz="4"/>
+              <w:right w:val="single" w:color="E0E0E0" w:sz="4"/>
+            </w:tcBorders>
+            <w:shd w:fill="FAFAFA" w:val="clear"/>
+            <w:tcMar>
+              <w:top w:type="dxa" w:w="60"/>
+              <w:left w:type="dxa" w:w="160"/>
+              <w:bottom w:type="dxa" w:w="60"/>
+              <w:right w:type="dxa" w:w="160"/>
+            </w:tcMar>
+          </w:tcPr>
+          <w:p>
+            <w:r>
+              <w:rPr>
+                <w:sz w:val="22"/>
+                <w:szCs w:val="22"/>
+              </w:rPr>
+              <w:t xml:space="preserve"/>
+            </w:r>
+          </w:p>
+        </w:tc>
+      </w:tr>
+      <w:tr>
+        <w:trPr>
+          <w:trHeight w:val="480"/>
+        </w:trPr>
+        <w:tc>
+          <w:tcPr>
+            <w:tcW w:type="dxa" w:w="9638"/>
+            <w:tcBorders>
+              <w:top w:val="single" w:color="E0E0E0" w:sz="4"/>
+              <w:left w:val="single" w:color="E0E0E0" w:sz="4"/>
+              <w:bottom w:val="single" w:color="E0E0E0" w:sz="4"/>
+              <w:right w:val="single" w:color="E0E0E0" w:sz="4"/>
+            </w:tcBorders>
+            <w:shd w:fill="FAFAFA" w:val="clear"/>
+            <w:tcMar>
+              <w:top w:type="dxa" w:w="60"/>
+              <w:left w:type="dxa" w:w="160"/>
+              <w:bottom w:type="dxa" w:w="60"/>
+              <w:right w:type="dxa" w:w="160"/>
+            </w:tcMar>
+          </w:tcPr>
+          <w:p>
+            <w:r>
+              <w:rPr>
+                <w:sz w:val="22"/>
+                <w:szCs w:val="22"/>
+              </w:rPr>
+              <w:t xml:space="preserve"/>
+            </w:r>
+          </w:p>
+        </w:tc>
+      </w:tr>
+      <w:tr>
+        <w:trPr>
+          <w:trHeight w:val="480"/>
+        </w:trPr>
+        <w:tc>
+          <w:tcPr>
+            <w:tcW w:type="dxa" w:w="9638"/>
+            <w:tcBorders>
+              <w:top w:val="single" w:color="E0E0E0" w:sz="4"/>
+              <w:left w:val="single" w:color="E0E0E0" w:sz="4"/>
+              <w:bottom w:val="single" w:color="E0E0E0" w:sz="4"/>
+              <w:right w:val="single" w:color="E0E0E0" w:sz="4"/>
+            </w:tcBorders>
+            <w:shd w:fill="FAFAFA" w:val="clear"/>
+            <w:tcMar>
+              <w:top w:type="dxa" w:w="60"/>
+              <w:left w:type="dxa" w:w="160"/>
+              <w:bottom w:type="dxa" w:w="60"/>
+              <w:right w:type="dxa" w:w="160"/>
+            </w:tcMar>
+          </w:tcPr>
+          <w:p>
+            <w:r>
+              <w:rPr>
+                <w:sz w:val="22"/>
+                <w:szCs w:val="22"/>
+              </w:rPr>
+              <w:t xml:space="preserve"/>
             </w:r>
           </w:p>
         </w:tc>
@@ -954,7 +964,35 @@
     </w:tbl>
     <w:p>
       <w:pPr>
-        <w:spacing w:after="160"/>
+        <w:spacing w:after="200"/>
+      </w:pPr>
+    </w:p>
+    <w:p>
+      <w:r>
+        <w:br w:type="page"/>
+      </w:r>
+    </w:p>
+    <w:p>
+      <w:pPr>
+        <w:shd w:fill="3949AB" w:val="clear"/>
+        <w:spacing w:after="0" w:before="320"/>
+        <w:ind w:left="200" w:right="200"/>
+      </w:pPr>
+      <w:r>
+        <w:rPr>
+          <w:rFonts w:ascii="Arial" w:cs="Arial" w:eastAsia="Arial" w:hAnsi="Arial"/>
+          <w:b/>
+          <w:bCs/>
+          <w:color w:val="FFFFFF"/>
+          <w:sz w:val="26"/>
+          <w:szCs w:val="26"/>
+        </w:rPr>
+        <w:t xml:space="preserve">Parte B — Reto: mini API y comparación real</w:t>
+      </w:r>
+    </w:p>
+    <w:p>
+      <w:pPr>
+        <w:spacing w:after="120"/>
       </w:pPr>
     </w:p>
     <w:p>
@@ -973,21 +1011,7 @@
           <w:sz w:val="24"/>
           <w:szCs w:val="24"/>
         </w:rPr>
-        <w:t xml:space="preserve">Mide la latencia real</w:t>
-      </w:r>
-    </w:p>
-    <w:p>
-      <w:pPr>
-        <w:spacing w:after="100"/>
-      </w:pPr>
-      <w:r>
-        <w:rPr>
-          <w:rFonts w:ascii="Arial" w:cs="Arial" w:eastAsia="Arial" w:hAnsi="Arial"/>
-          <w:color w:val="212121"/>
-          <w:sz w:val="22"/>
-          <w:szCs w:val="22"/>
-        </w:rPr>
-        <w:t xml:space="preserve">Medidas de latencia, distinguiendo claramente arranque en frío de invocación ya caliente, para la función y para la instancia.</w:t>
+        <w:t xml:space="preserve">Monta la mini API</w:t>
       </w:r>
     </w:p>
     <w:tbl>
@@ -1006,8 +1030,41 @@
         <w:gridCol w:w="9638"/>
       </w:tblGrid>
       <w:tr>
+        <w:tc>
+          <w:tcPr>
+            <w:tcW w:type="dxa" w:w="9638"/>
+            <w:tcBorders>
+              <w:top w:val="none" w:color="FFFFFF" w:sz="0"/>
+              <w:left w:val="none" w:color="FFFFFF" w:sz="0"/>
+              <w:bottom w:val="none" w:color="FFFFFF" w:sz="0"/>
+              <w:right w:val="none" w:color="FFFFFF" w:sz="0"/>
+            </w:tcBorders>
+            <w:shd w:fill="3949AB" w:val="clear"/>
+            <w:tcMar>
+              <w:top w:type="dxa" w:w="80"/>
+              <w:left w:type="dxa" w:w="160"/>
+              <w:bottom w:type="dxa" w:w="80"/>
+              <w:right w:type="dxa" w:w="160"/>
+            </w:tcMar>
+          </w:tcPr>
+          <w:p>
+            <w:r>
+              <w:rPr>
+                <w:rFonts w:ascii="Arial" w:cs="Arial" w:eastAsia="Arial" w:hAnsi="Arial"/>
+                <w:b/>
+                <w:bCs/>
+                <w:color w:val="FFFFFF"/>
+                <w:sz w:val="20"/>
+                <w:szCs w:val="20"/>
+              </w:rPr>
+              <w:t xml:space="preserve">📸 La pasarela de API montada delante de la función, resolviendo la consulta de metadatos de una imagen de producto</w:t>
+            </w:r>
+          </w:p>
+        </w:tc>
+      </w:tr>
+      <w:tr>
         <w:trPr>
-          <w:trHeight w:val="480"/>
+          <w:trHeight w:val="2400"/>
         </w:trPr>
         <w:tc>
           <w:tcPr>
@@ -1020,147 +1077,26 @@
             </w:tcBorders>
             <w:shd w:fill="FAFAFA" w:val="clear"/>
             <w:tcMar>
-              <w:top w:type="dxa" w:w="60"/>
-              <w:left w:type="dxa" w:w="160"/>
-              <w:bottom w:type="dxa" w:w="60"/>
-              <w:right w:type="dxa" w:w="160"/>
-            </w:tcMar>
-          </w:tcPr>
-          <w:p>
-            <w:r>
-              <w:rPr>
-                <w:sz w:val="22"/>
-                <w:szCs w:val="22"/>
-              </w:rPr>
-              <w:t xml:space="preserve"/>
-            </w:r>
-          </w:p>
-        </w:tc>
-      </w:tr>
-      <w:tr>
-        <w:trPr>
-          <w:trHeight w:val="480"/>
-        </w:trPr>
-        <w:tc>
-          <w:tcPr>
-            <w:tcW w:type="dxa" w:w="9638"/>
-            <w:tcBorders>
-              <w:top w:val="single" w:color="E0E0E0" w:sz="4"/>
-              <w:left w:val="single" w:color="E0E0E0" w:sz="4"/>
-              <w:bottom w:val="single" w:color="E0E0E0" w:sz="4"/>
-              <w:right w:val="single" w:color="E0E0E0" w:sz="4"/>
-            </w:tcBorders>
-            <w:shd w:fill="FAFAFA" w:val="clear"/>
-            <w:tcMar>
-              <w:top w:type="dxa" w:w="60"/>
-              <w:left w:type="dxa" w:w="160"/>
-              <w:bottom w:type="dxa" w:w="60"/>
-              <w:right w:type="dxa" w:w="160"/>
-            </w:tcMar>
-          </w:tcPr>
-          <w:p>
-            <w:r>
-              <w:rPr>
-                <w:sz w:val="22"/>
-                <w:szCs w:val="22"/>
-              </w:rPr>
-              <w:t xml:space="preserve"/>
-            </w:r>
-          </w:p>
-        </w:tc>
-      </w:tr>
-      <w:tr>
-        <w:trPr>
-          <w:trHeight w:val="480"/>
-        </w:trPr>
-        <w:tc>
-          <w:tcPr>
-            <w:tcW w:type="dxa" w:w="9638"/>
-            <w:tcBorders>
-              <w:top w:val="single" w:color="E0E0E0" w:sz="4"/>
-              <w:left w:val="single" w:color="E0E0E0" w:sz="4"/>
-              <w:bottom w:val="single" w:color="E0E0E0" w:sz="4"/>
-              <w:right w:val="single" w:color="E0E0E0" w:sz="4"/>
-            </w:tcBorders>
-            <w:shd w:fill="FAFAFA" w:val="clear"/>
-            <w:tcMar>
-              <w:top w:type="dxa" w:w="60"/>
-              <w:left w:type="dxa" w:w="160"/>
-              <w:bottom w:type="dxa" w:w="60"/>
-              <w:right w:type="dxa" w:w="160"/>
-            </w:tcMar>
-          </w:tcPr>
-          <w:p>
-            <w:r>
-              <w:rPr>
-                <w:sz w:val="22"/>
-                <w:szCs w:val="22"/>
-              </w:rPr>
-              <w:t xml:space="preserve"/>
-            </w:r>
-          </w:p>
-        </w:tc>
-      </w:tr>
-      <w:tr>
-        <w:trPr>
-          <w:trHeight w:val="480"/>
-        </w:trPr>
-        <w:tc>
-          <w:tcPr>
-            <w:tcW w:type="dxa" w:w="9638"/>
-            <w:tcBorders>
-              <w:top w:val="single" w:color="E0E0E0" w:sz="4"/>
-              <w:left w:val="single" w:color="E0E0E0" w:sz="4"/>
-              <w:bottom w:val="single" w:color="E0E0E0" w:sz="4"/>
-              <w:right w:val="single" w:color="E0E0E0" w:sz="4"/>
-            </w:tcBorders>
-            <w:shd w:fill="FAFAFA" w:val="clear"/>
-            <w:tcMar>
-              <w:top w:type="dxa" w:w="60"/>
-              <w:left w:type="dxa" w:w="160"/>
-              <w:bottom w:type="dxa" w:w="60"/>
-              <w:right w:type="dxa" w:w="160"/>
-            </w:tcMar>
-          </w:tcPr>
-          <w:p>
-            <w:r>
-              <w:rPr>
-                <w:sz w:val="22"/>
-                <w:szCs w:val="22"/>
-              </w:rPr>
-              <w:t xml:space="preserve"/>
-            </w:r>
-          </w:p>
-        </w:tc>
-      </w:tr>
-      <w:tr>
-        <w:trPr>
-          <w:trHeight w:val="480"/>
-        </w:trPr>
-        <w:tc>
-          <w:tcPr>
-            <w:tcW w:type="dxa" w:w="9638"/>
-            <w:tcBorders>
-              <w:top w:val="single" w:color="E0E0E0" w:sz="4"/>
-              <w:left w:val="single" w:color="E0E0E0" w:sz="4"/>
-              <w:bottom w:val="single" w:color="E0E0E0" w:sz="4"/>
-              <w:right w:val="single" w:color="E0E0E0" w:sz="4"/>
-            </w:tcBorders>
-            <w:shd w:fill="FAFAFA" w:val="clear"/>
-            <w:tcMar>
-              <w:top w:type="dxa" w:w="60"/>
-              <w:left w:type="dxa" w:w="160"/>
-              <w:bottom w:type="dxa" w:w="60"/>
-              <w:right w:type="dxa" w:w="160"/>
-            </w:tcMar>
-          </w:tcPr>
-          <w:p>
-            <w:r>
-              <w:rPr>
-                <w:sz w:val="22"/>
-                <w:szCs w:val="22"/>
-              </w:rPr>
-              <w:t xml:space="preserve"/>
+              <w:top w:type="dxa" w:w="80"/>
+              <w:left w:type="dxa" w:w="160"/>
+              <w:bottom w:type="dxa" w:w="80"/>
+              <w:right w:type="dxa" w:w="160"/>
+            </w:tcMar>
+          </w:tcPr>
+          <w:p>
+            <w:pPr>
+              <w:jc w:val="center"/>
+            </w:pPr>
+            <w:r>
+              <w:rPr>
+                <w:rFonts w:ascii="Arial" w:cs="Arial" w:eastAsia="Arial" w:hAnsi="Arial"/>
+                <w:i/>
+                <w:iCs/>
+                <w:color w:val="757575"/>
+                <w:sz w:val="20"/>
+                <w:szCs w:val="20"/>
+              </w:rPr>
+              <w:t xml:space="preserve">[Pega aquí la captura de pantalla]</w:t>
             </w:r>
           </w:p>
         </w:tc>
@@ -1168,13 +1104,8 @@
     </w:tbl>
     <w:p>
       <w:pPr>
-        <w:spacing w:after="200"/>
-      </w:pPr>
-    </w:p>
-    <w:p>
-      <w:r>
-        <w:br w:type="page"/>
-      </w:r>
+        <w:spacing w:after="160"/>
+      </w:pPr>
     </w:p>
     <w:p>
       <w:pPr>
@@ -1192,21 +1123,7 @@
           <w:sz w:val="24"/>
           <w:szCs w:val="24"/>
         </w:rPr>
-        <w:t xml:space="preserve">Estima el coste para dos volúmenes de tráfico</w:t>
-      </w:r>
-    </w:p>
-    <w:p>
-      <w:pPr>
-        <w:spacing w:after="100"/>
-      </w:pPr>
-      <w:r>
-        <w:rPr>
-          <w:rFonts w:ascii="Arial" w:cs="Arial" w:eastAsia="Arial" w:hAnsi="Arial"/>
-          <w:color w:val="212121"/>
-          <w:sz w:val="22"/>
-          <w:szCs w:val="22"/>
-        </w:rPr>
-        <w:t xml:space="preserve">Comparación de coste (función frente a instancia) para tráfico bajo y para tráfico alto, con cifras reales de la calculadora.</w:t>
+        <w:t xml:space="preserve">Mide la latencia real</w:t>
       </w:r>
     </w:p>
     <w:tbl>
@@ -1225,8 +1142,41 @@
         <w:gridCol w:w="9638"/>
       </w:tblGrid>
       <w:tr>
+        <w:tc>
+          <w:tcPr>
+            <w:tcW w:type="dxa" w:w="9638"/>
+            <w:tcBorders>
+              <w:top w:val="none" w:color="FFFFFF" w:sz="0"/>
+              <w:left w:val="none" w:color="FFFFFF" w:sz="0"/>
+              <w:bottom w:val="none" w:color="FFFFFF" w:sz="0"/>
+              <w:right w:val="none" w:color="FFFFFF" w:sz="0"/>
+            </w:tcBorders>
+            <w:shd w:fill="3949AB" w:val="clear"/>
+            <w:tcMar>
+              <w:top w:type="dxa" w:w="80"/>
+              <w:left w:type="dxa" w:w="160"/>
+              <w:bottom w:type="dxa" w:w="80"/>
+              <w:right w:type="dxa" w:w="160"/>
+            </w:tcMar>
+          </w:tcPr>
+          <w:p>
+            <w:r>
+              <w:rPr>
+                <w:rFonts w:ascii="Arial" w:cs="Arial" w:eastAsia="Arial" w:hAnsi="Arial"/>
+                <w:b/>
+                <w:bCs/>
+                <w:color w:val="FFFFFF"/>
+                <w:sz w:val="20"/>
+                <w:szCs w:val="20"/>
+              </w:rPr>
+              <w:t xml:space="preserve">📸 Terminal o CloudWatch con las medidas de latencia: al menos una invocación en frío y varias en caliente, para la función y para la instancia</w:t>
+            </w:r>
+          </w:p>
+        </w:tc>
+      </w:tr>
+      <w:tr>
         <w:trPr>
-          <w:trHeight w:val="480"/>
+          <w:trHeight w:val="2400"/>
         </w:trPr>
         <w:tc>
           <w:tcPr>
@@ -1239,23 +1189,65 @@
             </w:tcBorders>
             <w:shd w:fill="FAFAFA" w:val="clear"/>
             <w:tcMar>
-              <w:top w:type="dxa" w:w="60"/>
-              <w:left w:type="dxa" w:w="160"/>
-              <w:bottom w:type="dxa" w:w="60"/>
-              <w:right w:type="dxa" w:w="160"/>
-            </w:tcMar>
-          </w:tcPr>
-          <w:p>
-            <w:r>
-              <w:rPr>
-                <w:sz w:val="22"/>
-                <w:szCs w:val="22"/>
-              </w:rPr>
-              <w:t xml:space="preserve"/>
-            </w:r>
-          </w:p>
-        </w:tc>
-      </w:tr>
+              <w:top w:type="dxa" w:w="80"/>
+              <w:left w:type="dxa" w:w="160"/>
+              <w:bottom w:type="dxa" w:w="80"/>
+              <w:right w:type="dxa" w:w="160"/>
+            </w:tcMar>
+          </w:tcPr>
+          <w:p>
+            <w:pPr>
+              <w:jc w:val="center"/>
+            </w:pPr>
+            <w:r>
+              <w:rPr>
+                <w:rFonts w:ascii="Arial" w:cs="Arial" w:eastAsia="Arial" w:hAnsi="Arial"/>
+                <w:i/>
+                <w:iCs/>
+                <w:color w:val="757575"/>
+                <w:sz w:val="20"/>
+                <w:szCs w:val="20"/>
+              </w:rPr>
+              <w:t xml:space="preserve">[Pega aquí la captura de pantalla]</w:t>
+            </w:r>
+          </w:p>
+        </w:tc>
+      </w:tr>
+    </w:tbl>
+    <w:p>
+      <w:pPr>
+        <w:spacing w:after="120"/>
+      </w:pPr>
+    </w:p>
+    <w:p>
+      <w:pPr>
+        <w:spacing w:after="100"/>
+      </w:pPr>
+      <w:r>
+        <w:rPr>
+          <w:rFonts w:ascii="Arial" w:cs="Arial" w:eastAsia="Arial" w:hAnsi="Arial"/>
+          <w:color w:val="212121"/>
+          <w:sz w:val="22"/>
+          <w:szCs w:val="22"/>
+        </w:rPr>
+        <w:t xml:space="preserve">A partir de esas medidas: ¿cuánto añade el arranque en frío? ¿Cómo se compara la función ya caliente con la instancia?</w:t>
+      </w:r>
+    </w:p>
+    <w:tbl>
+      <w:tblPr>
+        <w:tblW w:type="dxa" w:w="9638"/>
+        <w:tblBorders>
+          <w:top w:val="single" w:color="auto" w:sz="4"/>
+          <w:left w:val="single" w:color="auto" w:sz="4"/>
+          <w:bottom w:val="single" w:color="auto" w:sz="4"/>
+          <w:right w:val="single" w:color="auto" w:sz="4"/>
+          <w:insideH w:val="single" w:color="auto" w:sz="4"/>
+          <w:insideV w:val="single" w:color="auto" w:sz="4"/>
+        </w:tblBorders>
+      </w:tblPr>
+      <w:tblGrid>
+        <w:gridCol w:w="9638"/>
+      </w:tblGrid>
       <w:tr>
         <w:trPr>
           <w:trHeight w:val="480"/>
@@ -1288,6 +1280,222 @@
           </w:p>
         </w:tc>
       </w:tr>
+      <w:tr>
+        <w:trPr>
+          <w:trHeight w:val="480"/>
+        </w:trPr>
+        <w:tc>
+          <w:tcPr>
+            <w:tcW w:type="dxa" w:w="9638"/>
+            <w:tcBorders>
+              <w:top w:val="single" w:color="E0E0E0" w:sz="4"/>
+              <w:left w:val="single" w:color="E0E0E0" w:sz="4"/>
+              <w:bottom w:val="single" w:color="E0E0E0" w:sz="4"/>
+              <w:right w:val="single" w:color="E0E0E0" w:sz="4"/>
+            </w:tcBorders>
+            <w:shd w:fill="FAFAFA" w:val="clear"/>
+            <w:tcMar>
+              <w:top w:type="dxa" w:w="60"/>
+              <w:left w:type="dxa" w:w="160"/>
+              <w:bottom w:type="dxa" w:w="60"/>
+              <w:right w:type="dxa" w:w="160"/>
+            </w:tcMar>
+          </w:tcPr>
+          <w:p>
+            <w:r>
+              <w:rPr>
+                <w:sz w:val="22"/>
+                <w:szCs w:val="22"/>
+              </w:rPr>
+              <w:t xml:space="preserve"/>
+            </w:r>
+          </w:p>
+        </w:tc>
+      </w:tr>
+      <w:tr>
+        <w:trPr>
+          <w:trHeight w:val="480"/>
+        </w:trPr>
+        <w:tc>
+          <w:tcPr>
+            <w:tcW w:type="dxa" w:w="9638"/>
+            <w:tcBorders>
+              <w:top w:val="single" w:color="E0E0E0" w:sz="4"/>
+              <w:left w:val="single" w:color="E0E0E0" w:sz="4"/>
+              <w:bottom w:val="single" w:color="E0E0E0" w:sz="4"/>
+              <w:right w:val="single" w:color="E0E0E0" w:sz="4"/>
+            </w:tcBorders>
+            <w:shd w:fill="FAFAFA" w:val="clear"/>
+            <w:tcMar>
+              <w:top w:type="dxa" w:w="60"/>
+              <w:left w:type="dxa" w:w="160"/>
+              <w:bottom w:type="dxa" w:w="60"/>
+              <w:right w:type="dxa" w:w="160"/>
+            </w:tcMar>
+          </w:tcPr>
+          <w:p>
+            <w:r>
+              <w:rPr>
+                <w:sz w:val="22"/>
+                <w:szCs w:val="22"/>
+              </w:rPr>
+              <w:t xml:space="preserve"/>
+            </w:r>
+          </w:p>
+        </w:tc>
+      </w:tr>
+    </w:tbl>
+    <w:p>
+      <w:pPr>
+        <w:spacing w:after="200"/>
+      </w:pPr>
+    </w:p>
+    <w:p>
+      <w:r>
+        <w:br w:type="page"/>
+      </w:r>
+    </w:p>
+    <w:p>
+      <w:pPr>
+        <w:pBdr>
+          <w:bottom w:val="single" w:color="FFA000" w:sz="4" w:space="1"/>
+        </w:pBdr>
+        <w:spacing w:after="120" w:before="240"/>
+      </w:pPr>
+      <w:r>
+        <w:rPr>
+          <w:rFonts w:ascii="Arial" w:cs="Arial" w:eastAsia="Arial" w:hAnsi="Arial"/>
+          <w:b/>
+          <w:bCs/>
+          <w:color w:val="3949AB"/>
+          <w:sz w:val="24"/>
+          <w:szCs w:val="24"/>
+        </w:rPr>
+        <w:t xml:space="preserve">Estima el coste para dos volúmenes de tráfico</w:t>
+      </w:r>
+    </w:p>
+    <w:tbl>
+      <w:tblPr>
+        <w:tblW w:type="dxa" w:w="9638"/>
+        <w:tblBorders>
+          <w:top w:val="single" w:color="auto" w:sz="4"/>
+          <w:left w:val="single" w:color="auto" w:sz="4"/>
+          <w:bottom w:val="single" w:color="auto" w:sz="4"/>
+          <w:right w:val="single" w:color="auto" w:sz="4"/>
+          <w:insideH w:val="single" w:color="auto" w:sz="4"/>
+          <w:insideV w:val="single" w:color="auto" w:sz="4"/>
+        </w:tblBorders>
+      </w:tblPr>
+      <w:tblGrid>
+        <w:gridCol w:w="9638"/>
+      </w:tblGrid>
+      <w:tr>
+        <w:tc>
+          <w:tcPr>
+            <w:tcW w:type="dxa" w:w="9638"/>
+            <w:tcBorders>
+              <w:top w:val="none" w:color="FFFFFF" w:sz="0"/>
+              <w:left w:val="none" w:color="FFFFFF" w:sz="0"/>
+              <w:bottom w:val="none" w:color="FFFFFF" w:sz="0"/>
+              <w:right w:val="none" w:color="FFFFFF" w:sz="0"/>
+            </w:tcBorders>
+            <w:shd w:fill="3949AB" w:val="clear"/>
+            <w:tcMar>
+              <w:top w:type="dxa" w:w="80"/>
+              <w:left w:type="dxa" w:w="160"/>
+              <w:bottom w:type="dxa" w:w="80"/>
+              <w:right w:type="dxa" w:w="160"/>
+            </w:tcMar>
+          </w:tcPr>
+          <w:p>
+            <w:r>
+              <w:rPr>
+                <w:rFonts w:ascii="Arial" w:cs="Arial" w:eastAsia="Arial" w:hAnsi="Arial"/>
+                <w:b/>
+                <w:bCs/>
+                <w:color w:val="FFFFFF"/>
+                <w:sz w:val="20"/>
+                <w:szCs w:val="20"/>
+              </w:rPr>
+              <w:t xml:space="preserve">📸 Calculadora de precios de AWS con el coste de ambas opciones para tráfico bajo y para tráfico alto</w:t>
+            </w:r>
+          </w:p>
+        </w:tc>
+      </w:tr>
+      <w:tr>
+        <w:trPr>
+          <w:trHeight w:val="2400"/>
+        </w:trPr>
+        <w:tc>
+          <w:tcPr>
+            <w:tcW w:type="dxa" w:w="9638"/>
+            <w:tcBorders>
+              <w:top w:val="single" w:color="E0E0E0" w:sz="4"/>
+              <w:left w:val="single" w:color="E0E0E0" w:sz="4"/>
+              <w:bottom w:val="single" w:color="E0E0E0" w:sz="4"/>
+              <w:right w:val="single" w:color="E0E0E0" w:sz="4"/>
+            </w:tcBorders>
+            <w:shd w:fill="FAFAFA" w:val="clear"/>
+            <w:tcMar>
+              <w:top w:type="dxa" w:w="80"/>
+              <w:left w:type="dxa" w:w="160"/>
+              <w:bottom w:type="dxa" w:w="80"/>
+              <w:right w:type="dxa" w:w="160"/>
+            </w:tcMar>
+          </w:tcPr>
+          <w:p>
+            <w:pPr>
+              <w:jc w:val="center"/>
+            </w:pPr>
+            <w:r>
+              <w:rPr>
+                <w:rFonts w:ascii="Arial" w:cs="Arial" w:eastAsia="Arial" w:hAnsi="Arial"/>
+                <w:i/>
+                <w:iCs/>
+                <w:color w:val="757575"/>
+                <w:sz w:val="20"/>
+                <w:szCs w:val="20"/>
+              </w:rPr>
+              <w:t xml:space="preserve">[Pega aquí la captura de pantalla]</w:t>
+            </w:r>
+          </w:p>
+        </w:tc>
+      </w:tr>
+    </w:tbl>
+    <w:p>
+      <w:pPr>
+        <w:spacing w:after="120"/>
+      </w:pPr>
+    </w:p>
+    <w:p>
+      <w:pPr>
+        <w:spacing w:after="100"/>
+      </w:pPr>
+      <w:r>
+        <w:rPr>
+          <w:rFonts w:ascii="Arial" w:cs="Arial" w:eastAsia="Arial" w:hAnsi="Arial"/>
+          <w:color w:val="212121"/>
+          <w:sz w:val="22"/>
+          <w:szCs w:val="22"/>
+        </w:rPr>
+        <w:t xml:space="preserve">¿Qué opción sale más barata en cada volumen de tráfico, y por qué?</w:t>
+      </w:r>
+    </w:p>
+    <w:tbl>
+      <w:tblPr>
+        <w:tblW w:type="dxa" w:w="9638"/>
+        <w:tblBorders>
+          <w:top w:val="single" w:color="auto" w:sz="4"/>
+          <w:left w:val="single" w:color="auto" w:sz="4"/>
+          <w:bottom w:val="single" w:color="auto" w:sz="4"/>
+          <w:right w:val="single" w:color="auto" w:sz="4"/>
+          <w:insideH w:val="single" w:color="auto" w:sz="4"/>
+          <w:insideV w:val="single" w:color="auto" w:sz="4"/>
+        </w:tblBorders>
+      </w:tblPr>
+      <w:tblGrid>
+        <w:gridCol w:w="9638"/>
+      </w:tblGrid>
       <w:tr>
         <w:trPr>
           <w:trHeight w:val="480"/>

</xml_diff>